<commit_message>
docs: rewrite README with screenshots; refresh viva guide and runbook
- README: highlights, screenshots, Mermaid workflow, quick start, page
  guide, project structure, chain of custody, security controls, results,
  CLI reference, testing, configuration, limitations and future work.
- Screenshots captured with demo data only.
- Viva guide and commands runbook rebuilt for the current dashboard
  (accounts, provenance, Cases, Help, assistant) and new paths.

Co-Authored-By: Claude Opus 5.5 <noreply@anthropic.com>
</commit_message>
<xml_diff>
--- a/docs/Memory_Forensics_AI_Triage_Viva_Defense_Guide.docx
+++ b/docs/Memory_Forensics_AI_Triage_Viva_Defense_Guide.docx
@@ -2343,7 +2343,7 @@
                 <w:color w:val="222222"/>
                 <w:sz w:val="19"/>
               </w:rPr>
-              <w:t>train_model.py</w:t>
+              <w:t>training/train_model.py</w:t>
             </w:r>
           </w:p>
         </w:tc>
@@ -2411,7 +2411,7 @@
                 <w:color w:val="222222"/>
                 <w:sz w:val="19"/>
               </w:rPr>
-              <w:t>train_multiclass.py</w:t>
+              <w:t>training/train_multiclass.py</w:t>
             </w:r>
           </w:p>
         </w:tc>
@@ -2479,7 +2479,7 @@
                 <w:color w:val="222222"/>
                 <w:sz w:val="19"/>
               </w:rPr>
-              <w:t>evaluate_model.py</w:t>
+              <w:t>evaluation/evaluate_model.py</w:t>
             </w:r>
           </w:p>
         </w:tc>
@@ -2547,7 +2547,7 @@
                 <w:color w:val="222222"/>
                 <w:sz w:val="19"/>
               </w:rPr>
-              <w:t>benchmark.py</w:t>
+              <w:t>evaluation/benchmark.py</w:t>
             </w:r>
           </w:p>
         </w:tc>
@@ -2615,7 +2615,7 @@
                 <w:color w:val="222222"/>
                 <w:sz w:val="19"/>
               </w:rPr>
-              <w:t>explain_model.py</w:t>
+              <w:t>evaluation/explain_model.py</w:t>
             </w:r>
           </w:p>
         </w:tc>
@@ -2683,7 +2683,7 @@
                 <w:color w:val="222222"/>
                 <w:sz w:val="19"/>
               </w:rPr>
-              <w:t>test_lime.py</w:t>
+              <w:t>evaluation/lime_example.py</w:t>
             </w:r>
           </w:p>
         </w:tc>
@@ -2751,7 +2751,7 @@
                 <w:color w:val="222222"/>
                 <w:sz w:val="19"/>
               </w:rPr>
-              <w:t>verify_data_integrity.py</w:t>
+              <w:t>evaluation/verify_data_integrity.py</w:t>
             </w:r>
           </w:p>
         </w:tc>
@@ -2819,7 +2819,7 @@
                 <w:color w:val="222222"/>
                 <w:sz w:val="19"/>
               </w:rPr>
-              <w:t>pin_model_hashes.py</w:t>
+              <w:t>admin/pin_model_hashes.py</w:t>
             </w:r>
           </w:p>
         </w:tc>
@@ -2887,7 +2887,7 @@
                 <w:color w:val="222222"/>
                 <w:sz w:val="19"/>
               </w:rPr>
-              <w:t>simulate_zeroday.py</w:t>
+              <w:t>data/simulate_zeroday.py</w:t>
             </w:r>
           </w:p>
         </w:tc>
@@ -2955,7 +2955,7 @@
                 <w:color w:val="222222"/>
                 <w:sz w:val="19"/>
               </w:rPr>
-              <w:t>generate_synthetic_threats.py</w:t>
+              <w:t>data/generate_synthetic_threats.py</w:t>
             </w:r>
           </w:p>
         </w:tc>
@@ -3029,7 +3029,7 @@
                 <w:color w:val="222222"/>
                 <w:sz w:val="19"/>
               </w:rPr>
-              <w:t>extract_real_benign.py</w:t>
+              <w:t>data/extract_real_benign.py</w:t>
             </w:r>
           </w:p>
         </w:tc>
@@ -3097,7 +3097,7 @@
                 <w:color w:val="222222"/>
                 <w:sz w:val="19"/>
               </w:rPr>
-              <w:t>extract_confident_samples.py</w:t>
+              <w:t>data/extract_confident_samples.py</w:t>
             </w:r>
           </w:p>
         </w:tc>
@@ -3165,7 +3165,7 @@
                 <w:color w:val="222222"/>
                 <w:sz w:val="19"/>
               </w:rPr>
-              <w:t>generate_report.py</w:t>
+              <w:t>reports/generate_report.py</w:t>
             </w:r>
           </w:p>
         </w:tc>
@@ -3226,12 +3226,12 @@
         <w:spacing w:before="280" w:after="120"/>
       </w:pPr>
       <w:r>
-        <w:t>7. Inside the Web Application (app.py)</w:t>
+        <w:t>7. Inside the Web Application (app.py + memtriage/)</w:t>
       </w:r>
     </w:p>
     <w:p>
       <w:r>
-        <w:t>app.py is the production nerve center of the project, implemented in Streamlit. It provides an intuitive, interactive cyber forensic cockpit styled with a modern glassmorphic dark theme. Here is how each major code section operates:</w:t>
+        <w:t>app.py is the Streamlit dashboard (triage workflow, models, SHAP/LIME, PDF report and the Cases page). The supporting modules live in the memtriage/ package. Here is what each part does:</w:t>
       </w:r>
     </w:p>
     <w:p>
@@ -3243,10 +3243,10 @@
         <w:rPr>
           <w:b/>
         </w:rPr>
-        <w:t xml:space="preserve">• Section 1-3: Setup &amp; Audit Logger: </w:t>
+        <w:t xml:space="preserve">• Accounts &amp; sign-in (memtriage/auth.py, admin_pages.py): </w:t>
       </w:r>
       <w:r>
-        <w:t>Configures logging to logs/triage_audit.log. Every triage run is logged with an immutable timestamp, evidence hash, file name, row number, risk classification, and anomaly flag.</w:t>
+        <w:t>Local accounts with PBKDF2-SHA256 password hashes, Administrator and Analyst roles, a 5-attempt lockout, 30-minute idle timeout and forced password change for new accounts. The account store is sealed with an HMAC so it cannot be edited by hand.</w:t>
       </w:r>
     </w:p>
     <w:p>
@@ -3258,10 +3258,10 @@
         <w:rPr>
           <w:b/>
         </w:rPr>
-        <w:t xml:space="preserve">• Section 4: FEATURE_MEANINGS Dictionary: </w:t>
+        <w:t xml:space="preserve">• Case sessions &amp; provenance (app.py): </w:t>
       </w:r>
       <w:r>
-        <w:t>A comprehensive plain-English dictionary mapping cryptic Volatility metrics (e.g. handles.avg_handles_per_proc) to plain-English titles, technical descriptions, and real-world threat explanations.</w:t>
+        <w:t>Every analysis runs inside a case opened by the signed-in analyst, recording who the findings are prepared for (recipient, purpose, reference) and, for each evidence item, where it came from (device, custodian, location, collector, time, tool) plus the optional hash reported by the acquisition tool.</w:t>
       </w:r>
     </w:p>
     <w:p>
@@ -3273,10 +3273,10 @@
         <w:rPr>
           <w:b/>
         </w:rPr>
-        <w:t xml:space="preserve">• Section 5: Cached Resource Loaders: </w:t>
+        <w:t xml:space="preserve">• Evidence integrity (memtriage/evidence_integrity.py): </w:t>
       </w:r>
       <w:r>
-        <w:t>Uses @st.cache_resource and @st.cache_data to load the Random Forest model, Isolation Forest model, and 500-row background dataset once into memory, keeping dashboard inference instant (&lt; 50ms).</w:t>
+        <w:t>SHA-256/MD5 hashing at every stage and an HMAC-keyed chain-of-custody ledger: each event is linked to the previous one with a secret key, so the ledger cannot be edited and re-chained. Model files are verified against pinned hashes before they are loaded.</w:t>
       </w:r>
     </w:p>
     <w:p>
@@ -3288,10 +3288,10 @@
         <w:rPr>
           <w:b/>
         </w:rPr>
-        <w:t xml:space="preserve">• Section 6: Core Triage Function (run_triage): </w:t>
+        <w:t xml:space="preserve">• Input validation (memtriage/input_validation.py): </w:t>
       </w:r>
       <w:r>
-        <w:t>Accepts sample DataFrame, aligns columns to expected_cols, calculates malware probability via rf_model.predict_proba, predicts zero-day outliers via iso_model, and computes SHA-256 evidence hash.</w:t>
+        <w:t>Rejects oversized, binary or unrelated uploads and checks memory-image file signatures. The feature gate blocks infinite/negative values or &gt;20% missing features and requires analyst acknowledgement for smaller gaps.</w:t>
       </w:r>
     </w:p>
     <w:p>
@@ -3303,10 +3303,10 @@
         <w:rPr>
           <w:b/>
         </w:rPr>
-        <w:t xml:space="preserve">• Section 7: SHAP Explanation Renderer: </w:t>
+        <w:t xml:space="preserve">• Memory dump extraction (memtriage/memdump_extractor.py): </w:t>
       </w:r>
       <w:r>
-        <w:t>Calculates exact Shapley values using TreeExplainer, sorts top 10 impactful indicators, renders 3 Plain-English Decision Driver Cards, and outputs a horizontal waterfall impact chart.</w:t>
+        <w:t>Runs windows.info plus 9 Volatility 3 plugins and builds the 55 CIC-MalMem2022 features, hashing the image before and after to prove it was not modified.</w:t>
       </w:r>
     </w:p>
     <w:p>
@@ -3318,10 +3318,10 @@
         <w:rPr>
           <w:b/>
         </w:rPr>
-        <w:t xml:space="preserve">• Section 8: LIME Explanation Renderer: </w:t>
+        <w:t xml:space="preserve">• Models &amp; explainability (app.py): </w:t>
       </w:r>
       <w:r>
-        <w:t>Generates local surrogate linear decision rules with LimeTabularExplainer, displaying the observed condition (e.g., malfind.ninjections &gt; 1.00) and whether it pushed the verdict toward Malware or Benign.</w:t>
+        <w:t>Random Forest probability and risk tier, Isolation Forest zero-day check, SHAP (TreeExplainer) global drivers and LIME local rules, shown as diverging charts and plain-English driver cards.</w:t>
       </w:r>
     </w:p>
     <w:p>
@@ -3333,10 +3333,10 @@
         <w:rPr>
           <w:b/>
         </w:rPr>
-        <w:t xml:space="preserve">• Section 9: ReportLab PDF Generator: </w:t>
+        <w:t xml:space="preserve">• Sealed PDF report (app.py): </w:t>
       </w:r>
       <w:r>
-        <w:t>Dynamically compiles a multi-page, executive Forensic Incident Dossier containing chain-of-custody hashes, verdict tables, top SHAP/LIME indicators, and incident response recommendations.</w:t>
+        <w:t>ReportLab dossier with provenance, verdict, SHAP/LIME tables, response actions and the full custody ledger; its SHA-256 is recorded in the ledger, the audit log and a .sha256 sidecar.</w:t>
       </w:r>
     </w:p>
     <w:p>
@@ -3348,10 +3348,25 @@
         <w:rPr>
           <w:b/>
         </w:rPr>
-        <w:t xml:space="preserve">• Section 10-12: Interactive UI &amp; Batch Scoring: </w:t>
+        <w:t xml:space="preserve">• Tamper-evident audit log (memtriage/audit_log.py): </w:t>
       </w:r>
       <w:r>
-        <w:t>Allows analysts to either upload custom CSV files or quick-load verified threat presets, inspect raw metrics, execute single-row deep-dive triage, or run rapid batch scoring across all records.</w:t>
+        <w:t>Every sign-in, account change, case event and verdict is written as an HMAC-chained line under a file lock; edits, deletions, truncation and duplicates are detected and shown on the administrator's Audit log page.</w:t>
+      </w:r>
+    </w:p>
+    <w:p>
+      <w:pPr>
+        <w:spacing w:after="60"/>
+        <w:ind w:left="288"/>
+      </w:pPr>
+      <w:r>
+        <w:rPr>
+          <w:b/>
+        </w:rPr>
+        <w:t xml:space="preserve">• Usability (help_page.py, assistant.py, ui_theme.py): </w:t>
+      </w:r>
+      <w:r>
+        <w:t>Cases page to reopen past work, Help page with glossary and FAQ, an offline help assistant that explains the current result, and the Emerald theme with an interactive background.</w:t>
       </w:r>
     </w:p>
     <w:p>
@@ -3850,7 +3865,7 @@
               <w:t>"Data leakage occurs when information from outside the training dataset is used to create the model, artificially inflating test performance. In the MalMem2022 dataset, the raw CSV contained columns like 'Category' (which explicitly spelled out the malware family, e.g., 'Trojan-Emotet') and 'Class' ('Benign' vs 'Malware').</w:t>
               <w:br/>
               <w:br/>
-              <w:t>In our data pipeline (audited in scripts/verify_data_integrity.py), we strictly isolated 'Class' as the prediction label y and completely dropped 'Category' before training. The model was trained purely on the 55 independent volatile memory telemetry features (X). In addition, train-test splitting was performed using stratified sampling prior to any model fitting, ensuring no test data was seen during training."</w:t>
+              <w:t>In our data pipeline (audited in scripts/evaluation/verify_data_integrity.py), we strictly isolated 'Class' as the prediction label y and completely dropped 'Category' before training. The model was trained purely on the 55 independent volatile memory telemetry features (X). In addition, train-test splitting was performed using stratified sampling prior to any model fitting, ensuring no test data was seen during training."</w:t>
             </w:r>
           </w:p>
         </w:tc>
@@ -4143,10 +4158,10 @@
           <w:b/>
           <w:color w:val="1F3864"/>
         </w:rPr>
-        <w:t xml:space="preserve">• Step 1: Launch the System: </w:t>
+        <w:t xml:space="preserve">• Step 1: Launch &amp; sign in: </w:t>
       </w:r>
       <w:r>
-        <w:t>Open your terminal in the project directory and execute: streamlit run app.py. The browser opens to the dark-themed cyber forensic dashboard.</w:t>
+        <w:t>Double-click run_app.bat (or run: streamlit run app.py). Sign in as an analyst — point out the lockout and that every sign-in is audited.</w:t>
       </w:r>
     </w:p>
     <w:p>
@@ -4159,10 +4174,10 @@
           <w:b/>
           <w:color w:val="1F3864"/>
         </w:rPr>
-        <w:t xml:space="preserve">• Step 2: Demonstrate the Normal Baseline: </w:t>
+        <w:t xml:space="preserve">• Step 2: Open a case: </w:t>
       </w:r>
       <w:r>
-        <w:t>Under Telemetry Ingestion Source, select 'Quick-Load Verified Sample' and choose clean_system_baseline.csv. Click 'Execute Autonomous Forensic Triage'. Show that the verdict is NORMAL (green, ~0% risk), and highlight how SHAP values push left towards the clean baseline.</w:t>
+        <w:t>Enter the case number and who the findings are prepared for (e.g. an investigating officer, purpose: Incident response). Note that the analyst is the signed-in account, not typed.</w:t>
       </w:r>
     </w:p>
     <w:p>
@@ -4175,10 +4190,10 @@
           <w:b/>
           <w:color w:val="1F3864"/>
         </w:rPr>
-        <w:t xml:space="preserve">• Step 3: Demonstrate an Active Ransomware Threat: </w:t>
+        <w:t xml:space="preserve">• Step 3: Record provenance &amp; load evidence: </w:t>
       </w:r>
       <w:r>
-        <w:t>Switch the profile to fresh_aggressive_ransomware.csv and click Execute Triage. Show the immediate transition to HIGH RISK (red, &gt;80% risk). Point out the metric cards displaying Malware Confidence and zero-day anomaly indicators.</w:t>
+        <w:t>Show the Evidence origin panel (device, custodian, collector, tool, acquisition hash). Choose Sample profile → clean_system_baseline.csv and show the green input-validation check.</w:t>
       </w:r>
     </w:p>
     <w:p>
@@ -4191,10 +4206,10 @@
           <w:b/>
           <w:color w:val="1F3864"/>
         </w:rPr>
-        <w:t xml:space="preserve">• Step 4: Explain the XAI Decision Drivers (SHAP): </w:t>
+        <w:t xml:space="preserve">• Step 4: Normal baseline: </w:t>
       </w:r>
       <w:r>
-        <w:t>Scroll to Section 04 and show the 3 Plain-English Decision Driver Cards. Explain to your professor: 'Sir, look at handles.avg_handles_per_proc—the AI elevated the malware risk by +45% because this process opened an astronomical number of resource handles, which is the exact behavioral hallmark of ransomware encrypting files.'</w:t>
+        <w:t>Press Analyse snapshot. Show the NORMAL verdict and that SHAP drivers push towards benign.</w:t>
       </w:r>
     </w:p>
     <w:p>
@@ -4207,10 +4222,10 @@
           <w:b/>
           <w:color w:val="1F3864"/>
         </w:rPr>
-        <w:t xml:space="preserve">• Step 5: Show Local Corroboration (LIME): </w:t>
+        <w:t xml:space="preserve">• Step 5: Active ransomware: </w:t>
       </w:r>
       <w:r>
-        <w:t>Scroll to Section 05 and show the LIME table. Explain that LIME independently verified this decision using local threshold rules, confirming that the model's verdict is robust and unbiased.</w:t>
+        <w:t>Switch to fresh_aggressive_ransomware.csv and analyse again. Show the higher risk, the zero-day anomaly flag and the plain-English driver cards; ask the Assistant “explain my result”.</w:t>
       </w:r>
     </w:p>
     <w:p>
@@ -4223,10 +4238,10 @@
           <w:b/>
           <w:color w:val="1F3864"/>
         </w:rPr>
-        <w:t xml:space="preserve">• Step 6: Download the Official PDF Report: </w:t>
+        <w:t xml:space="preserve">• Step 6: Explainability: </w:t>
       </w:r>
       <w:r>
-        <w:t>Click 'Download Forensic Report (PDF)'. Open the PDF from the outputs/ folder. Show your professor the executive header, the SHA-256 evidence hash, the triage table, top explainability drivers, and the incident response playbook.</w:t>
+        <w:t>Open the Explainability tab: SHAP shows each feature's contribution; LIME gives independent local rules. Agreement between them increases trust.</w:t>
       </w:r>
     </w:p>
     <w:p>
@@ -4239,10 +4254,42 @@
           <w:b/>
           <w:color w:val="1F3864"/>
         </w:rPr>
-        <w:t xml:space="preserve">• Step 7: Verify Chain of Custody: </w:t>
+        <w:t xml:space="preserve">• Step 7: Provenance &amp; chain of custody: </w:t>
       </w:r>
       <w:r>
-        <w:t>Scroll to the bottom of the dashboard and expand Section 07 (Live Chain-of-Custody Audit Log). Show that every single action performed during the demo was appended to logs/triage_audit.log with timestamps and cryptographic hashes.</w:t>
+        <w:t>Open the Provenance tab (where it came from / who it is for), then Chain of custody: every checkpoint MATCHes the acquisition hash and the ledger is HMAC-linked.</w:t>
+      </w:r>
+    </w:p>
+    <w:p>
+      <w:pPr>
+        <w:spacing w:after="80"/>
+        <w:ind w:left="288"/>
+      </w:pPr>
+      <w:r>
+        <w:rPr>
+          <w:b/>
+          <w:color w:val="1F3864"/>
+        </w:rPr>
+        <w:t xml:space="preserve">• Step 8: Sealed report: </w:t>
+      </w:r>
+      <w:r>
+        <w:t>Download the PDF from the Report tab. Show provenance, verdict, explanations and the ledger, then prove integrity with: certutil -hashfile report.pdf SHA256.</w:t>
+      </w:r>
+    </w:p>
+    <w:p>
+      <w:pPr>
+        <w:spacing w:after="80"/>
+        <w:ind w:left="288"/>
+      </w:pPr>
+      <w:r>
+        <w:rPr>
+          <w:b/>
+          <w:color w:val="1F3864"/>
+        </w:rPr>
+        <w:t xml:space="preserve">• Step 9: Audit trail: </w:t>
+      </w:r>
+      <w:r>
+        <w:t>Sign in as administrator and open Audit log: sign-ins/sign-outs, account changes and all events, with the integrity banner confirming the log has not been altered.</w:t>
       </w:r>
     </w:p>
     <w:sectPr>

</xml_diff>

<commit_message>
feat: rebrand as HazMem with original logo and toxic-atmosphere background
- Name: HazMem ("hazmat" + "memory"). Package memtriage/ -> hazmem/
  (python -m hazmem.audit_log ...), environment variables HAZMEM_*.
- Logo: original vector artwork (hazmem/assets/hazmem_logo.svg, PNG
  exports): skull in a toxic-green respirator with glowing biohazard eyes
  and charcoal filter cartridges. Used in the header, sidebar, favicon and
  the PDF report header.
- Background: rising spores on three depth layers with mouse parallax,
  cursor repulsion and links, drifting gas clouds, a slowly turning
  biohazard watermark and spore bursts on click; still frame under
  prefers-reduced-motion.
- README (logo, name story), screenshots and both Word documents updated.

Co-Authored-By: Claude Opus 5.5 <noreply@anthropic.com>
</commit_message>
<xml_diff>
--- a/docs/Memory_Forensics_AI_Triage_Viva_Defense_Guide.docx
+++ b/docs/Memory_Forensics_AI_Triage_Viva_Defense_Guide.docx
@@ -3226,12 +3226,12 @@
         <w:spacing w:before="280" w:after="120"/>
       </w:pPr>
       <w:r>
-        <w:t>7. Inside the Web Application (app.py + memtriage/)</w:t>
+        <w:t>7. Inside the Web Application (app.py + hazmem/)</w:t>
       </w:r>
     </w:p>
     <w:p>
       <w:r>
-        <w:t>app.py is the Streamlit dashboard (triage workflow, models, SHAP/LIME, PDF report and the Cases page). The supporting modules live in the memtriage/ package. Here is what each part does:</w:t>
+        <w:t>app.py is the Streamlit dashboard (triage workflow, models, SHAP/LIME, PDF report and the Cases page). The supporting modules live in the hazmem/ package. Here is what each part does:</w:t>
       </w:r>
     </w:p>
     <w:p>
@@ -3243,7 +3243,7 @@
         <w:rPr>
           <w:b/>
         </w:rPr>
-        <w:t xml:space="preserve">• Accounts &amp; sign-in (memtriage/auth.py, admin_pages.py): </w:t>
+        <w:t xml:space="preserve">• Accounts &amp; sign-in (hazmem/auth.py, admin_pages.py): </w:t>
       </w:r>
       <w:r>
         <w:t>Local accounts with PBKDF2-SHA256 password hashes, Administrator and Analyst roles, a 5-attempt lockout, 30-minute idle timeout and forced password change for new accounts. The account store is sealed with an HMAC so it cannot be edited by hand.</w:t>
@@ -3273,7 +3273,7 @@
         <w:rPr>
           <w:b/>
         </w:rPr>
-        <w:t xml:space="preserve">• Evidence integrity (memtriage/evidence_integrity.py): </w:t>
+        <w:t xml:space="preserve">• Evidence integrity (hazmem/evidence_integrity.py): </w:t>
       </w:r>
       <w:r>
         <w:t>SHA-256/MD5 hashing at every stage and an HMAC-keyed chain-of-custody ledger: each event is linked to the previous one with a secret key, so the ledger cannot be edited and re-chained. Model files are verified against pinned hashes before they are loaded.</w:t>
@@ -3288,7 +3288,7 @@
         <w:rPr>
           <w:b/>
         </w:rPr>
-        <w:t xml:space="preserve">• Input validation (memtriage/input_validation.py): </w:t>
+        <w:t xml:space="preserve">• Input validation (hazmem/input_validation.py): </w:t>
       </w:r>
       <w:r>
         <w:t>Rejects oversized, binary or unrelated uploads and checks memory-image file signatures. The feature gate blocks infinite/negative values or &gt;20% missing features and requires analyst acknowledgement for smaller gaps.</w:t>
@@ -3303,7 +3303,7 @@
         <w:rPr>
           <w:b/>
         </w:rPr>
-        <w:t xml:space="preserve">• Memory dump extraction (memtriage/memdump_extractor.py): </w:t>
+        <w:t xml:space="preserve">• Memory dump extraction (hazmem/memdump_extractor.py): </w:t>
       </w:r>
       <w:r>
         <w:t>Runs windows.info plus 9 Volatility 3 plugins and builds the 55 CIC-MalMem2022 features, hashing the image before and after to prove it was not modified.</w:t>
@@ -3348,7 +3348,7 @@
         <w:rPr>
           <w:b/>
         </w:rPr>
-        <w:t xml:space="preserve">• Tamper-evident audit log (memtriage/audit_log.py): </w:t>
+        <w:t xml:space="preserve">• Tamper-evident audit log (hazmem/audit_log.py): </w:t>
       </w:r>
       <w:r>
         <w:t>Every sign-in, account change, case event and verdict is written as an HMAC-chained line under a file lock; edits, deletions, truncation and duplicates are detected and shown on the administrator's Audit log page.</w:t>

</xml_diff>

<commit_message>
feat: simple view, Royal Purple theme and friendlier fonts
- Simple view by default (mentor feedback): two-field case start, short
  evidence-origin form, one "Analyse evidence" button, a plain-English
  result ("Looks clean" / "Needs a closer look" / "Likely infected")
  with everyday next steps and reasons. "Show technical details" (saved
  per account) brings back hashes, previews, SHAP/LIME, provenance, the
  custody ledger, audit tab and engine status.
- Royal Purple palette for light and dark modes, violet logo with pink
  biohazard eyes, purple background, glowing violet-to-pink buttons.
- Fonts: Poppins headings and Inter text with normal letter spacing
  (words no longer run together); config theme option fixed.
- Help/assistant/README/Word documents/screenshots updated; 104 tests.

Co-Authored-By: Claude Opus 5.5 <noreply@anthropic.com>
</commit_message>
<xml_diff>
--- a/docs/Memory_Forensics_AI_Triage_Viva_Defense_Guide.docx
+++ b/docs/Memory_Forensics_AI_Triage_Viva_Defense_Guide.docx
@@ -3363,10 +3363,10 @@
         <w:rPr>
           <w:b/>
         </w:rPr>
-        <w:t xml:space="preserve">• Usability (help_page.py, assistant.py, ui_theme.py): </w:t>
+        <w:t xml:space="preserve">• Usability (help_page.py, assistant.py, ui_theme.py, knowledge.py): </w:t>
       </w:r>
       <w:r>
-        <w:t>Cases page to reopen past work, Help page with glossary and FAQ, an offline help assistant that explains the current result, and the Emerald theme with an interactive background.</w:t>
+        <w:t>A simple view by default (plain-English result, everyday next steps) with a Show technical details switch for hashes, ledger and SHAP/LIME; Cases page, Help page with glossary and FAQ, an offline help assistant, the Royal Purple theme with Light/Dark/Auto modes and an interactive background.</w:t>
       </w:r>
     </w:p>
     <w:p>
@@ -4174,10 +4174,10 @@
           <w:b/>
           <w:color w:val="1F3864"/>
         </w:rPr>
-        <w:t xml:space="preserve">• Step 2: Open a case: </w:t>
+        <w:t xml:space="preserve">• Step 2: Start a case: </w:t>
       </w:r>
       <w:r>
-        <w:t>Enter the case number and who the findings are prepared for (e.g. an investigating officer, purpose: Incident response). Note that the analyst is the signed-in account, not typed.</w:t>
+        <w:t>Enter the case number and the recipient (e.g. an investigating officer), press Start case. Note that the analyst is the signed-in account, not typed.</w:t>
       </w:r>
     </w:p>
     <w:p>
@@ -4190,10 +4190,10 @@
           <w:b/>
           <w:color w:val="1F3864"/>
         </w:rPr>
-        <w:t xml:space="preserve">• Step 3: Record provenance &amp; load evidence: </w:t>
+        <w:t xml:space="preserve">• Step 3: Add evidence: </w:t>
       </w:r>
       <w:r>
-        <w:t>Show the Evidence origin panel (device, custodian, collector, tool, acquisition hash). Choose Sample profile → clean_system_baseline.csv and show the green input-validation check.</w:t>
+        <w:t>Show where it came from (device, collector, optional expected hash). Choose Try a sample → clean_system_baseline.csv and point out 'Evidence checked'.</w:t>
       </w:r>
     </w:p>
     <w:p>
@@ -4209,7 +4209,7 @@
         <w:t xml:space="preserve">• Step 4: Normal baseline: </w:t>
       </w:r>
       <w:r>
-        <w:t>Press Analyse snapshot. Show the NORMAL verdict and that SHAP drivers push towards benign.</w:t>
+        <w:t>Press Analyse evidence. Show the plain-English 'Looks clean' result, then switch on Show technical details to show SHAP drivers pushing towards benign.</w:t>
       </w:r>
     </w:p>
     <w:p>

</xml_diff>